<commit_message>
feat(legal): Kursabbruch-Default auf Erstattung umgestellt + 2J-Auto-Refund-Cron
Sarah-Befund 2026-05-25: AGB-Klausel 'Default Guthaben bei keiner Wahl' war
juristisch riskant (Schweigen = Zustimmung zu Verlust des Geldanspruchs gemaess
$ 326 BGB). Jetzt rechtssicher gemacht:

1. Default bei keiner Wahl nach 7 Tagen = ERSTATTUNG (statt Guthaben)
2. Falls Yogi Guthaben waehlt + nach 2 Jahren nicht eingeloest = Auto-Erstattung
3. Freundliche Werbung fuer Guthaben-Wahl im Email-Text (Cashflow-Vorteil)

Aenderungen:
- Edge Function send-email v58: course_cancelled + yogi_course_cancel_choice Texte
- API-Route: Default-Token-Ablauf-Verhalten (neuer Cron fn_expire_cancellation_tokens)
- DB: fn_check_guthaben_2y_expiry() + pg_cron taeglich 04:00
- scripts/generate-agb.js + Yoga-mit-Sarah-AGB.docx
- Tests angepasst
</commit_message>
<xml_diff>
--- a/Yoga-mit-Sarah-AGB.docx
+++ b/Yoga-mit-Sarah-AGB.docx
@@ -403,7 +403,7 @@
           <w:sz w:val="22"/>
           <w:szCs w:val="22"/>
         </w:rPr>
-        <w:t xml:space="preserve">Kursabbruch durch die Yogalehrerin (Wahloption Erstattung/Guthaben):</w:t>
+        <w:t xml:space="preserve">Kursabbruch durch die Yogalehrerin (mit Wahloption Erstattung oder Guthaben):</w:t>
       </w:r>
     </w:p>
     <w:p>
@@ -478,20 +478,33 @@
           <w:sz w:val="22"/>
           <w:szCs w:val="22"/>
         </w:rPr>
-        <w:t xml:space="preserve">Kurs-Guthaben in Höhe der ausgefallenen Stunden, einlösbar für einen neuen Kurs innerhalb von 2 Jahren ab Vergabe.</w:t>
-      </w:r>
-    </w:p>
-    <w:p>
-      <w:pPr>
-        <w:spacing w:after="120"/>
-      </w:pPr>
-      <w:r>
-        <w:rPr>
-          <w:rFonts w:ascii="Arial" w:cs="Arial" w:eastAsia="Arial" w:hAnsi="Arial"/>
-          <w:sz w:val="22"/>
-          <w:szCs w:val="22"/>
-        </w:rPr>
-        <w:t xml:space="preserve">Triffst du innerhalb von 7 Tagen keine Wahl, wird automatisch das Guthaben gutgeschrieben. Das Guthaben ist nicht auszahlbar. Eine Einlösung ist nur möglich, wenn innerhalb der 2-Jahres-Frist ein freier Platz in einem von dir gewünschten Kurs verfügbar ist; andernfalls verfällt das Guthaben ersatzlos.</w:t>
+        <w:t xml:space="preserve">Kurs-Guthaben in Höhe der ausgefallenen Stunden, hinterlegt in der App und einlösbar ausschließlich für einen neuen Kurs innerhalb von 2 Jahren ab Vergabe.</w:t>
+      </w:r>
+    </w:p>
+    <w:p>
+      <w:pPr>
+        <w:spacing w:after="120"/>
+      </w:pPr>
+      <w:r>
+        <w:rPr>
+          <w:rFonts w:ascii="Arial" w:cs="Arial" w:eastAsia="Arial" w:hAnsi="Arial"/>
+          <w:sz w:val="22"/>
+          <w:szCs w:val="22"/>
+        </w:rPr>
+        <w:t xml:space="preserve">Triffst du innerhalb von 7 Tagen keine Wahl, wird dir der anteilige Geldbetrag automatisch erstattet. Ich melde mich dann persönlich bei dir wegen der Überweisung.</w:t>
+      </w:r>
+    </w:p>
+    <w:p>
+      <w:pPr>
+        <w:spacing w:after="120"/>
+      </w:pPr>
+      <w:r>
+        <w:rPr>
+          <w:rFonts w:ascii="Arial" w:cs="Arial" w:eastAsia="Arial" w:hAnsi="Arial"/>
+          <w:sz w:val="22"/>
+          <w:szCs w:val="22"/>
+        </w:rPr>
+        <w:t xml:space="preserve">Ich freue mich aber besonders, wenn du das Guthaben wählst — dann sehen wir uns hoffentlich im nächsten Kurs wieder. Das Guthaben ist 2 Jahre gültig. Sollte es bis dahin nicht eingelöst worden sein (z. B. weil kein passender Kurs zustande kommt oder du keinen freien Platz findest), wird dir der entsprechende Geldbetrag automatisch ausgezahlt — du verlierst also in keinem Fall etwas.</w:t>
       </w:r>
     </w:p>
     <w:p>

</xml_diff>

<commit_message>
Phase 2: Vorholfrist-Test, Inaktivitaets-Loeschung (24M, dry-run), AGB-Klausel
- tests/e2e/53-vorholfrist-stunde-im-fenster.spec.ts: dedizierter E2E-Test —
  eine Stunde ist nur buchbar, wenn die STUNDE selbst im Fenster liegt (nicht
  der Buchungszeitpunkt). Block-/Kontroll-/modelluebergreifender Fall.
- supabase/migrations/20260530_anonymize_user_audit_logs.sql: Live-RPC 1:1
  versioniert (keine Funktionsaenderung).
- supabase/migrations/20260530_cleanup_inactive_accounts.sql:
  find_inactive_accounts() + cleanup_inactive_accounts() (Default TROCKENLAUF,
  Admin hart ausgeschlossen, Batch-Limit) + woechentlicher pg_cron (dry-run).
- AGB: Inaktivitaets-Klausel (24 Monate) in scripts/generate-agb.js (Para 6),
  regenerierte Yoga-mit-Sarah-AGB.docx und In-App-Seite "Rechtliches".
- SYSTEM_DOCUMENTATION.md: Abschnitt 3.2 praezisiert, Abschnitt 7
  (Inaktivitaets-Loeschung) ergaenzt.

Co-Authored-By: Claude Opus 4.8 <noreply@anthropic.com>
</commit_message>
<xml_diff>
--- a/Yoga-mit-Sarah-AGB.docx
+++ b/Yoga-mit-Sarah-AGB.docx
@@ -273,7 +273,7 @@
           <w:sz w:val="22"/>
           <w:szCs w:val="22"/>
         </w:rPr>
-        <w:t xml:space="preserve">Eine kostenfreie Stornierung ist bis 7 Tage vor Veranstaltungsbeginn möglich. Danach fällt die vollständige Veranstaltungsgebühr an. Sollte die Gebühr bis 7 Tage vorher noch nicht bezahlt sein, bleibt die Rechnung dennoch bestehen und ist vollständig zu begleichen. Ausnahme: Du benennst einen Ersatzteilnehmer, der deinen Platz einnimmt.</w:t>
+        <w:t xml:space="preserve">Eine kostenfreie Stornierung ist bis 7 Tage vor Veranstaltungsbeginn möglich. Danach fällt die vollständige Veranstaltungsgebühr an. Sollte die Gebühr bis 7 Tage vorher noch nicht bezahlt sein, bleibt die Rechnung dennoch bestehen und ist vollständig zu begleichen. Ausnahme: Du benennst einen Ersatzteilnehmer, der deinen Platz einnimmt. Rückst du automatisch von der Warteliste nach, steht dir innerhalb von 60 Minuten nach dem Nachrücken ein kostenfreies Rücktrittsrecht zu; nach Ablauf dieser 60 Minuten gilt die 7-Tage-Stornofrist entsprechend.</w:t>
       </w:r>
     </w:p>
     <w:p>
@@ -1406,6 +1406,29 @@
           <w:szCs w:val="22"/>
         </w:rPr>
         <w:t xml:space="preserve">Insbesondere werden Daten zur Verwaltung deines App-Accounts (z. B. Buchungshistorie, Credits, Notfallkontakt) bei den von mir genutzten Auftragsverarbeitern (Vercel, Supabase, Brevo) verarbeitet — Details siehe Datenschutzerklärung.</w:t>
+      </w:r>
+    </w:p>
+    <w:p>
+      <w:pPr>
+        <w:spacing w:after="120"/>
+      </w:pPr>
+      <w:r>
+        <w:rPr>
+          <w:rFonts w:ascii="Arial" w:cs="Arial" w:eastAsia="Arial" w:hAnsi="Arial"/>
+          <w:b/>
+          <w:bCs/>
+          <w:sz w:val="22"/>
+          <w:szCs w:val="22"/>
+        </w:rPr>
+        <w:t xml:space="preserve">Löschung bei langer Inaktivität: </w:t>
+      </w:r>
+      <w:r>
+        <w:rPr>
+          <w:rFonts w:ascii="Arial" w:cs="Arial" w:eastAsia="Arial" w:hAnsi="Arial"/>
+          <w:sz w:val="22"/>
+          <w:szCs w:val="22"/>
+        </w:rPr>
+        <w:t xml:space="preserve">Aus Gründen der Datensparsamkeit (Art. 5 Abs. 1 lit. e DSGVO) werden App-Accounts, die länger als 24 Monate nicht mehr genutzt wurden, automatisch gelöscht bzw. anonymisiert. Maßgeblich ist dein letzter Login in der App. Bevor dein Account gelöscht wird, erhältst du rechtzeitig eine Vorwarnung per E-Mail an deine hinterlegte Adresse, und du kannst die Löschung jederzeit verhindern, indem du dich einfach wieder in der App anmeldest. Accounts mit noch offenen Credits, Guthaben oder zukünftigen Buchungen sind von der automatischen Löschung ausgenommen, solange ein gültiger Anspruch besteht. Bei der Löschung werden dein Name und deine E-Mail-Adresse entfernt; eine anonymisierte Buchungshistorie kann aus rechtlichen Gründen erhalten bleiben. Bereits verfallene Credits oder Guthaben werden nicht erstattet.</w:t>
       </w:r>
     </w:p>
     <w:p>

</xml_diff>

<commit_message>
Offene Dateien sichern: AGB + Datenschutz-Word frisch generiert, Test-Mail-Funktion Service-Key-Fix
AGB + Datenschutzerklaerung neu aus generate-agb.js / generate-datenschutz.js erzeugt (aktueller Stand). send-all-test-emails: Service-Role-Key statt anon (verify_jwt-Fix, Test-Tool funktioniert wieder). Reines Test-/Doku-Material, keine App-Workflow-Aenderung.

Co-Authored-By: Claude Opus 4.8 <noreply@anthropic.com>
</commit_message>
<xml_diff>
--- a/Yoga-mit-Sarah-AGB.docx
+++ b/Yoga-mit-Sarah-AGB.docx
@@ -50,7 +50,7 @@
           <w:sz w:val="22"/>
           <w:szCs w:val="22"/>
         </w:rPr>
-        <w:t xml:space="preserve">Stand: Mai 2026</w:t>
+        <w:t xml:space="preserve">Stand: Juni 2026</w:t>
       </w:r>
     </w:p>
     <w:p>
@@ -274,6 +274,19 @@
           <w:szCs w:val="22"/>
         </w:rPr>
         <w:t xml:space="preserve">Eine kostenfreie Stornierung ist bis 7 Tage vor Veranstaltungsbeginn möglich. Danach fällt die vollständige Veranstaltungsgebühr an. Sollte die Gebühr bis 7 Tage vorher noch nicht bezahlt sein, bleibt die Rechnung dennoch bestehen und ist vollständig zu begleichen. Ausnahme: Du benennst einen Ersatzteilnehmer, der deinen Platz einnimmt. Rückst du automatisch von der Warteliste nach, steht dir innerhalb von 60 Minuten nach dem Nachrücken ein kostenfreies Rücktrittsrecht zu; nach Ablauf dieser 60 Minuten gilt die 7-Tage-Stornofrist entsprechend.</w:t>
+      </w:r>
+    </w:p>
+    <w:p>
+      <w:pPr>
+        <w:spacing w:after="120"/>
+      </w:pPr>
+      <w:r>
+        <w:rPr>
+          <w:rFonts w:ascii="Arial" w:cs="Arial" w:eastAsia="Arial" w:hAnsi="Arial"/>
+          <w:sz w:val="22"/>
+          <w:szCs w:val="22"/>
+        </w:rPr>
+        <w:t xml:space="preserve">Danke für Dein Verständnis und deine Wertschätzung für meine Planung ❤️</w:t>
       </w:r>
     </w:p>
     <w:p>
@@ -324,7 +337,7 @@
           <w:sz w:val="22"/>
           <w:szCs w:val="22"/>
         </w:rPr>
-        <w:t xml:space="preserve">Bei einer Stornierung zwischen 13 und 7 Tagen vor Kursbeginn fällt eine Bearbeitungsgebühr von 30 € an, da der Platz kurzfristig neu vergeben werden muss.</w:t>
+        <w:t xml:space="preserve">Danach gilt: gebucht ist gebucht — die vollständige Kursgebühr fällt an.</w:t>
       </w:r>
     </w:p>
     <w:p>
@@ -342,7 +355,7 @@
           <w:sz w:val="22"/>
           <w:szCs w:val="22"/>
         </w:rPr>
-        <w:t xml:space="preserve">Ab Tag 6 fällt die volle Kursgebühr an, auch bei Nichterscheinen.</w:t>
+        <w:t xml:space="preserve">Option: Du kannst einen passenden Ersatzteilnehmer benennen.</w:t>
       </w:r>
     </w:p>
     <w:p>
@@ -360,7 +373,7 @@
           <w:sz w:val="22"/>
           <w:szCs w:val="22"/>
         </w:rPr>
-        <w:t xml:space="preserve">Du kannst jederzeit einen passenden Ersatzteilnehmer benennen.</w:t>
+        <w:t xml:space="preserve">Danke für Dein Verständnis und deine Wertschätzung für meine Planung ❤️</w:t>
       </w:r>
     </w:p>
     <w:p>
@@ -1536,7 +1549,7 @@
           <w:sz w:val="22"/>
           <w:szCs w:val="22"/>
         </w:rPr>
-        <w:t xml:space="preserve">Stand: Mai 2026</w:t>
+        <w:t xml:space="preserve">Stand: Juni 2026</w:t>
       </w:r>
     </w:p>
     <w:sectPr>

</xml_diff>